<commit_message>
Document retiring 系统术士 and announce it in the hall.
The duplicate IT sample is already hidden on startup; this keeps the notes and lobby copy in sync.

Co-authored-by: Cursor <cursoragent@cursor.com>
</commit_message>
<xml_diff>
--- a/backend/mdFile/新卡牌专属效果.docx
+++ b/backend/mdFile/新卡牌专属效果.docx
@@ -15114,7 +15114,7 @@
                 <w:color w:val="2D2D2D"/>
                 <w:sz w:val="21"/>
               </w:rPr>
-              <w:t>打补丁后日志才出来（图鉴样例卡，可不解锁）</w:t>
+              <w:t>已下架：与机械工匠共用立绘，图鉴不再显示</w:t>
             </w:r>
           </w:p>
         </w:tc>
@@ -15131,7 +15131,7 @@
           <w:color w:val="2E75B6"/>
           <w:sz w:val="26"/>
         </w:rPr>
-        <w:t>老板 B-01～B-07</w:t>
+        <w:t>老板 B-01～B-08</w:t>
       </w:r>
     </w:p>
     <w:p>
@@ -16841,6 +16841,218 @@
           </w:p>
         </w:tc>
       </w:tr>
+      <w:tr>
+        <w:tc>
+          <w:tcPr>
+            <w:tcW w:type="dxa" w:w="1247"/>
+            <w:tcBorders>
+              <w:top w:val="single" w:sz="4" w:space="0" w:color="8FAADC"/>
+              <w:left w:val="single" w:sz="4" w:space="0" w:color="8FAADC"/>
+              <w:bottom w:val="single" w:sz="4" w:space="0" w:color="8FAADC"/>
+              <w:right w:val="single" w:sz="4" w:space="0" w:color="8FAADC"/>
+            </w:tcBorders>
+            <w:tcMar>
+              <w:top w:w="40" w:type="dxa"/>
+              <w:left w:w="60" w:type="dxa"/>
+              <w:bottom w:w="40" w:type="dxa"/>
+              <w:right w:w="60" w:type="dxa"/>
+            </w:tcMar>
+            <w:vAlign w:val="center"/>
+            <w:shd w:val="clear" w:color="auto" w:fill="F7FAFC"/>
+          </w:tcPr>
+          <w:p>
+            <w:pPr>
+              <w:spacing w:before="0" w:after="0" w:line="259" w:lineRule="auto"/>
+              <w:jc w:val="center"/>
+            </w:pPr>
+            <w:r/>
+            <w:r>
+              <w:rPr>
+                <w:rFonts w:ascii="Calibri" w:hAnsi="Calibri" w:eastAsia="宋体"/>
+                <w:b w:val="0"/>
+                <w:color w:val="2D2D2D"/>
+                <w:sz w:val="21"/>
+              </w:rPr>
+              <w:t>B-08</w:t>
+            </w:r>
+          </w:p>
+        </w:tc>
+        <w:tc>
+          <w:tcPr>
+            <w:tcW w:type="dxa" w:w="1474"/>
+            <w:tcBorders>
+              <w:top w:val="single" w:sz="4" w:space="0" w:color="8FAADC"/>
+              <w:left w:val="single" w:sz="4" w:space="0" w:color="8FAADC"/>
+              <w:bottom w:val="single" w:sz="4" w:space="0" w:color="8FAADC"/>
+              <w:right w:val="single" w:sz="4" w:space="0" w:color="8FAADC"/>
+            </w:tcBorders>
+            <w:tcMar>
+              <w:top w:w="40" w:type="dxa"/>
+              <w:left w:w="60" w:type="dxa"/>
+              <w:bottom w:w="40" w:type="dxa"/>
+              <w:right w:w="60" w:type="dxa"/>
+            </w:tcMar>
+            <w:vAlign w:val="center"/>
+            <w:shd w:val="clear" w:color="auto" w:fill="F7FAFC"/>
+          </w:tcPr>
+          <w:p>
+            <w:pPr>
+              <w:spacing w:before="0" w:after="0" w:line="259" w:lineRule="auto"/>
+              <w:jc w:val="left"/>
+            </w:pPr>
+            <w:r/>
+            <w:r>
+              <w:rPr>
+                <w:rFonts w:ascii="Calibri" w:hAnsi="Calibri" w:eastAsia="宋体"/>
+                <w:b w:val="0"/>
+                <w:color w:val="2D2D2D"/>
+                <w:sz w:val="21"/>
+              </w:rPr>
+              <w:t>花舫主</w:t>
+            </w:r>
+          </w:p>
+        </w:tc>
+        <w:tc>
+          <w:tcPr>
+            <w:tcW w:type="dxa" w:w="850"/>
+            <w:tcBorders>
+              <w:top w:val="single" w:sz="4" w:space="0" w:color="8FAADC"/>
+              <w:left w:val="single" w:sz="4" w:space="0" w:color="8FAADC"/>
+              <w:bottom w:val="single" w:sz="4" w:space="0" w:color="8FAADC"/>
+              <w:right w:val="single" w:sz="4" w:space="0" w:color="8FAADC"/>
+            </w:tcBorders>
+            <w:tcMar>
+              <w:top w:w="40" w:type="dxa"/>
+              <w:left w:w="60" w:type="dxa"/>
+              <w:bottom w:w="40" w:type="dxa"/>
+              <w:right w:w="60" w:type="dxa"/>
+            </w:tcMar>
+            <w:vAlign w:val="center"/>
+            <w:shd w:val="clear" w:color="auto" w:fill="F7FAFC"/>
+          </w:tcPr>
+          <w:p>
+            <w:pPr>
+              <w:spacing w:before="0" w:after="0" w:line="259" w:lineRule="auto"/>
+              <w:jc w:val="center"/>
+            </w:pPr>
+            <w:r/>
+            <w:r>
+              <w:rPr>
+                <w:rFonts w:ascii="Calibri" w:hAnsi="Calibri" w:eastAsia="宋体"/>
+                <w:b w:val="0"/>
+                <w:color w:val="2D2D2D"/>
+                <w:sz w:val="21"/>
+              </w:rPr>
+              <w:t>2</w:t>
+            </w:r>
+          </w:p>
+        </w:tc>
+        <w:tc>
+          <w:tcPr>
+            <w:tcW w:type="dxa" w:w="1020"/>
+            <w:tcBorders>
+              <w:top w:val="single" w:sz="4" w:space="0" w:color="8FAADC"/>
+              <w:left w:val="single" w:sz="4" w:space="0" w:color="8FAADC"/>
+              <w:bottom w:val="single" w:sz="4" w:space="0" w:color="8FAADC"/>
+              <w:right w:val="single" w:sz="4" w:space="0" w:color="8FAADC"/>
+            </w:tcBorders>
+            <w:tcMar>
+              <w:top w:w="40" w:type="dxa"/>
+              <w:left w:w="60" w:type="dxa"/>
+              <w:bottom w:w="40" w:type="dxa"/>
+              <w:right w:w="60" w:type="dxa"/>
+            </w:tcMar>
+            <w:vAlign w:val="center"/>
+            <w:shd w:val="clear" w:color="auto" w:fill="F7FAFC"/>
+          </w:tcPr>
+          <w:p>
+            <w:pPr>
+              <w:spacing w:before="0" w:after="0" w:line="259" w:lineRule="auto"/>
+              <w:jc w:val="center"/>
+            </w:pPr>
+            <w:r/>
+            <w:r>
+              <w:rPr>
+                <w:rFonts w:ascii="Calibri" w:hAnsi="Calibri" w:eastAsia="宋体"/>
+                <w:b w:val="0"/>
+                <w:color w:val="2D2D2D"/>
+                <w:sz w:val="21"/>
+              </w:rPr>
+              <w:t>攻击</w:t>
+            </w:r>
+          </w:p>
+        </w:tc>
+        <w:tc>
+          <w:tcPr>
+            <w:tcW w:type="dxa" w:w="4876"/>
+            <w:tcBorders>
+              <w:top w:val="single" w:sz="4" w:space="0" w:color="8FAADC"/>
+              <w:left w:val="single" w:sz="4" w:space="0" w:color="8FAADC"/>
+              <w:bottom w:val="single" w:sz="4" w:space="0" w:color="8FAADC"/>
+              <w:right w:val="single" w:sz="4" w:space="0" w:color="8FAADC"/>
+            </w:tcBorders>
+            <w:tcMar>
+              <w:top w:w="40" w:type="dxa"/>
+              <w:left w:w="60" w:type="dxa"/>
+              <w:bottom w:w="40" w:type="dxa"/>
+              <w:right w:w="60" w:type="dxa"/>
+            </w:tcMar>
+            <w:vAlign w:val="center"/>
+            <w:shd w:val="clear" w:color="auto" w:fill="F7FAFC"/>
+          </w:tcPr>
+          <w:p>
+            <w:pPr>
+              <w:spacing w:before="0" w:after="0" w:line="259" w:lineRule="auto"/>
+              <w:jc w:val="left"/>
+            </w:pPr>
+            <w:r/>
+            <w:r>
+              <w:rPr>
+                <w:rFonts w:ascii="Calibri" w:hAnsi="Calibri" w:eastAsia="宋体"/>
+                <w:b w:val="0"/>
+                <w:color w:val="2D2D2D"/>
+                <w:sz w:val="21"/>
+              </w:rPr>
+              <w:t>立即造成 4 点伤害，并恢复自己 2 点血量</w:t>
+            </w:r>
+          </w:p>
+        </w:tc>
+        <w:tc>
+          <w:tcPr>
+            <w:tcW w:type="dxa" w:w="4139"/>
+            <w:tcBorders>
+              <w:top w:val="single" w:sz="4" w:space="0" w:color="8FAADC"/>
+              <w:left w:val="single" w:sz="4" w:space="0" w:color="8FAADC"/>
+              <w:bottom w:val="single" w:sz="4" w:space="0" w:color="8FAADC"/>
+              <w:right w:val="single" w:sz="4" w:space="0" w:color="8FAADC"/>
+            </w:tcBorders>
+            <w:tcMar>
+              <w:top w:w="40" w:type="dxa"/>
+              <w:left w:w="60" w:type="dxa"/>
+              <w:bottom w:w="40" w:type="dxa"/>
+              <w:right w:w="60" w:type="dxa"/>
+            </w:tcMar>
+            <w:vAlign w:val="center"/>
+            <w:shd w:val="clear" w:color="auto" w:fill="F7FAFC"/>
+          </w:tcPr>
+          <w:p>
+            <w:pPr>
+              <w:spacing w:before="0" w:after="0" w:line="259" w:lineRule="auto"/>
+              <w:jc w:val="left"/>
+            </w:pPr>
+            <w:r/>
+            <w:r>
+              <w:rPr>
+                <w:rFonts w:ascii="Calibri" w:hAnsi="Calibri" w:eastAsia="宋体"/>
+                <w:b w:val="0"/>
+                <w:color w:val="2D2D2D"/>
+                <w:sz w:val="21"/>
+              </w:rPr>
+              <w:t>花船宴饮：伤 4 自奶 2；强于酒娘的伤 2 自奶 1，也不撞珠宝商的伤 5 自盾</w:t>
+            </w:r>
+          </w:p>
+        </w:tc>
+      </w:tr>
     </w:tbl>
     <w:p>
       <w:pPr>
@@ -17076,6 +17288,146 @@
                 <w:sz w:val="21"/>
               </w:rPr>
               <w:t>增加 Word 版 `新卡牌专属效果.docx`（列：编号、名称、费用、类型、专属效果、设计说明）。</w:t>
+            </w:r>
+          </w:p>
+        </w:tc>
+      </w:tr>
+      <w:tr>
+        <w:tc>
+          <w:tcPr>
+            <w:tcW w:type="dxa" w:w="7126"/>
+            <w:tcBorders>
+              <w:top w:val="single" w:sz="4" w:space="0" w:color="8FAADC"/>
+              <w:left w:val="single" w:sz="4" w:space="0" w:color="8FAADC"/>
+              <w:bottom w:val="single" w:sz="4" w:space="0" w:color="8FAADC"/>
+              <w:right w:val="single" w:sz="4" w:space="0" w:color="8FAADC"/>
+            </w:tcBorders>
+            <w:tcMar>
+              <w:top w:w="40" w:type="dxa"/>
+              <w:left w:w="60" w:type="dxa"/>
+              <w:bottom w:w="40" w:type="dxa"/>
+              <w:right w:w="60" w:type="dxa"/>
+            </w:tcMar>
+            <w:vAlign w:val="center"/>
+          </w:tcPr>
+          <w:p>
+            <w:pPr>
+              <w:spacing w:before="0" w:after="0" w:line="259" w:lineRule="auto"/>
+              <w:jc w:val="center"/>
+            </w:pPr>
+            <w:r/>
+            <w:r>
+              <w:rPr>
+                <w:rFonts w:ascii="Calibri" w:hAnsi="Calibri" w:eastAsia="宋体"/>
+                <w:b w:val="0"/>
+                <w:color w:val="2D2D2D"/>
+                <w:sz w:val="21"/>
+              </w:rPr>
+              <w:t>2026-08-24</w:t>
+            </w:r>
+          </w:p>
+        </w:tc>
+        <w:tc>
+          <w:tcPr>
+            <w:tcW w:type="dxa" w:w="7126"/>
+            <w:tcBorders>
+              <w:top w:val="single" w:sz="4" w:space="0" w:color="8FAADC"/>
+              <w:left w:val="single" w:sz="4" w:space="0" w:color="8FAADC"/>
+              <w:bottom w:val="single" w:sz="4" w:space="0" w:color="8FAADC"/>
+              <w:right w:val="single" w:sz="4" w:space="0" w:color="8FAADC"/>
+            </w:tcBorders>
+            <w:tcMar>
+              <w:top w:w="40" w:type="dxa"/>
+              <w:left w:w="60" w:type="dxa"/>
+              <w:bottom w:w="40" w:type="dxa"/>
+              <w:right w:w="60" w:type="dxa"/>
+            </w:tcMar>
+            <w:vAlign w:val="center"/>
+          </w:tcPr>
+          <w:p>
+            <w:pPr>
+              <w:spacing w:before="0" w:after="0" w:line="259" w:lineRule="auto"/>
+              <w:jc w:val="left"/>
+            </w:pPr>
+            <w:r/>
+            <w:r>
+              <w:rPr>
+                <w:rFonts w:ascii="Calibri" w:hAnsi="Calibri" w:eastAsia="宋体"/>
+                <w:b w:val="0"/>
+                <w:color w:val="2D2D2D"/>
+                <w:sz w:val="21"/>
+              </w:rPr>
+              <w:t>新增人物收藏卡 `B-08` 花舫主，不替换现有卡面。后续新增改记入第二版。</w:t>
+            </w:r>
+          </w:p>
+        </w:tc>
+      </w:tr>
+      <w:tr>
+        <w:tc>
+          <w:tcPr>
+            <w:tcW w:type="dxa" w:w="7126"/>
+            <w:tcBorders>
+              <w:top w:val="single" w:sz="4" w:space="0" w:color="8FAADC"/>
+              <w:left w:val="single" w:sz="4" w:space="0" w:color="8FAADC"/>
+              <w:bottom w:val="single" w:sz="4" w:space="0" w:color="8FAADC"/>
+              <w:right w:val="single" w:sz="4" w:space="0" w:color="8FAADC"/>
+            </w:tcBorders>
+            <w:tcMar>
+              <w:top w:w="40" w:type="dxa"/>
+              <w:left w:w="60" w:type="dxa"/>
+              <w:bottom w:w="40" w:type="dxa"/>
+              <w:right w:w="60" w:type="dxa"/>
+            </w:tcMar>
+            <w:vAlign w:val="center"/>
+          </w:tcPr>
+          <w:p>
+            <w:pPr>
+              <w:spacing w:before="0" w:after="0" w:line="259" w:lineRule="auto"/>
+              <w:jc w:val="center"/>
+            </w:pPr>
+            <w:r/>
+            <w:r>
+              <w:rPr>
+                <w:rFonts w:ascii="Calibri" w:hAnsi="Calibri" w:eastAsia="宋体"/>
+                <w:b w:val="0"/>
+                <w:color w:val="2D2D2D"/>
+                <w:sz w:val="21"/>
+              </w:rPr>
+              <w:t>2026-08-26</w:t>
+            </w:r>
+          </w:p>
+        </w:tc>
+        <w:tc>
+          <w:tcPr>
+            <w:tcW w:type="dxa" w:w="7126"/>
+            <w:tcBorders>
+              <w:top w:val="single" w:sz="4" w:space="0" w:color="8FAADC"/>
+              <w:left w:val="single" w:sz="4" w:space="0" w:color="8FAADC"/>
+              <w:bottom w:val="single" w:sz="4" w:space="0" w:color="8FAADC"/>
+              <w:right w:val="single" w:sz="4" w:space="0" w:color="8FAADC"/>
+            </w:tcBorders>
+            <w:tcMar>
+              <w:top w:w="40" w:type="dxa"/>
+              <w:left w:w="60" w:type="dxa"/>
+              <w:bottom w:w="40" w:type="dxa"/>
+              <w:right w:w="60" w:type="dxa"/>
+            </w:tcMar>
+            <w:vAlign w:val="center"/>
+          </w:tcPr>
+          <w:p>
+            <w:pPr>
+              <w:spacing w:before="0" w:after="0" w:line="259" w:lineRule="auto"/>
+              <w:jc w:val="left"/>
+            </w:pPr>
+            <w:r/>
+            <w:r>
+              <w:rPr>
+                <w:rFonts w:ascii="Calibri" w:hAnsi="Calibri" w:eastAsia="宋体"/>
+                <w:b w:val="0"/>
+                <w:color w:val="2D2D2D"/>
+                <w:sz w:val="21"/>
+              </w:rPr>
+              <w:t>下架与机械工匠重复立绘的「系统术士」（T-01）。</w:t>
             </w:r>
           </w:p>
         </w:tc>

</xml_diff>